<commit_message>
Fase 3: voz de salida con Piper funcionando
</commit_message>
<xml_diff>
--- a/Proyecto_Jarvis_Documentacion.docx
+++ b/Proyecto_Jarvis_Documentacion.docx
@@ -874,6 +874,122 @@
           <w:shd w:fill="F0F0F0" w:val="clear"/>
         </w:rPr>
         <w:t xml:space="preserve">python chat_voz.py</w:t>
+      </w:r>
+    </w:p>
+    <w:p>
+      <w:pPr>
+        <w:pStyle w:val="Heading1"/>
+        <w:spacing w:after="200" w:before="400"/>
+      </w:pPr>
+      <w:r>
+        <w:t xml:space="preserve">Dudas y problemas técnicos (registro continuo)</w:t>
+      </w:r>
+    </w:p>
+    <w:p>
+      <w:pPr>
+        <w:spacing w:after="150"/>
+      </w:pPr>
+      <w:r>
+        <w:t xml:space="preserve">Esta sección recoge problemas técnicos reales que han ido surgiendo durante el desarrollo, junto con su diagnóstico y solución, para poder consultarlos en el futuro sin tener que recordar de memoria cómo se resolvieron. Se irá ampliando en cada avance.</w:t>
+      </w:r>
+    </w:p>
+    <w:p>
+      <w:pPr>
+        <w:pStyle w:val="Heading2"/>
+        <w:spacing w:after="150" w:before="300"/>
+      </w:pPr>
+      <w:r>
+        <w:t xml:space="preserve">Problema: la grabación de voz se cortaba antes de que el usuario terminara de hablar</w:t>
+      </w:r>
+    </w:p>
+    <w:p>
+      <w:pPr>
+        <w:spacing w:after="150"/>
+      </w:pPr>
+      <w:r>
+        <w:t xml:space="preserve">Síntoma: usando la primera versión de detección de silencio (con un UMBRAL_SILENCIO fijo, 0.01), la grabación paraba casi inmediatamente, cortando frases largas.</w:t>
+      </w:r>
+    </w:p>
+    <w:p>
+      <w:pPr>
+        <w:spacing w:after="150"/>
+      </w:pPr>
+      <w:r>
+        <w:t xml:space="preserve">Causa probable: el volumen real captado por el micrófono del usuario es distinto al que se asumió al elegir ese número fijo. Cada micrófono, sistema operativo y nivel de ganancia de entrada capta un volumen distinto, así que un umbral fijo "a ciegas" no sirve para todos los casos.</w:t>
+      </w:r>
+    </w:p>
+    <w:p>
+      <w:pPr>
+        <w:spacing w:after="150"/>
+      </w:pPr>
+      <w:r>
+        <w:t xml:space="preserve">Solución aplicada en dos pasos:</w:t>
+      </w:r>
+    </w:p>
+    <w:p>
+      <w:pPr>
+        <w:pStyle w:val="ListParagraph"/>
+        <w:numPr>
+          <w:ilvl w:val="0"/>
+          <w:numId w:val="1"/>
+        </w:numPr>
+        <w:spacing w:after="80"/>
+      </w:pPr>
+      <w:r>
+        <w:t xml:space="preserve">1) Se creó un script de diagnóstico (diagnostico_microfono.py) que muestra en tiempo real el volumen (RMS) que capta el micrófono, tanto en silencio como al hablar, para poder ver los números reales en vez de adivinarlos.</w:t>
+      </w:r>
+    </w:p>
+    <w:p>
+      <w:pPr>
+        <w:pStyle w:val="ListParagraph"/>
+        <w:numPr>
+          <w:ilvl w:val="0"/>
+          <w:numId w:val="1"/>
+        </w:numPr>
+        <w:spacing w:after="80"/>
+      </w:pPr>
+      <w:r>
+        <w:t xml:space="preserve">2) Se reescribió grabar_y_transcribir.py para que se AUTOCALIBRE: al empezar cada grabación, mide 1 segundo de ruido de fondo real de la habitación, y calcula el umbral de silencio como ese ruido de fondo multiplicado por un margen (MULTIPLICADOR_UMBRAL = 2.5), en vez de usar un número fijo igual para todo el mundo.</w:t>
+      </w:r>
+    </w:p>
+    <w:p>
+      <w:pPr>
+        <w:spacing w:after="150"/>
+      </w:pPr>
+      <w:r>
+        <w:t xml:space="preserve">Archivos relacionados: </w:t>
+      </w:r>
+      <w:r>
+        <w:rPr>
+          <w:rFonts w:ascii="Consolas" w:cs="Consolas" w:eastAsia="Consolas" w:hAnsi="Consolas"/>
+          <w:sz w:val="20"/>
+          <w:szCs w:val="20"/>
+          <w:shd w:fill="F0F0F0" w:val="clear"/>
+        </w:rPr>
+        <w:t xml:space="preserve">diagnostico_microfono.py</w:t>
+      </w:r>
+      <w:r>
+        <w:t xml:space="preserve"> (diagnóstico) y </w:t>
+      </w:r>
+      <w:r>
+        <w:rPr>
+          <w:rFonts w:ascii="Consolas" w:cs="Consolas" w:eastAsia="Consolas" w:hAnsi="Consolas"/>
+          <w:sz w:val="20"/>
+          <w:szCs w:val="20"/>
+          <w:shd w:fill="F0F0F0" w:val="clear"/>
+        </w:rPr>
+        <w:t xml:space="preserve">grabar_y_transcribir.py</w:t>
+      </w:r>
+      <w:r>
+        <w:t xml:space="preserve"> (versión autocalibrada, v3).</w:t>
+      </w:r>
+    </w:p>
+    <w:p>
+      <w:pPr>
+        <w:spacing w:after="150"/>
+      </w:pPr>
+      <w:r>
+        <w:t xml:space="preserve">Cómo usar el diagnóstico si el problema reaparece: ejecutar python diagnostico_microfono.py, quedarse en silencio unos segundos y luego hablar normal, y comparar los números de volumen mostrados en cada caso. Si el ruido de fondo y el volumen al hablar están muy cerca (poca diferencia entre ambos), puede hacer falta subir MULTIPLICADOR_UMBRAL o revisar la configuración de ganancia del micrófono en Windows.</w:t>
       </w:r>
     </w:p>
     <w:p>

</xml_diff>